<commit_message>
added to tokenize a new word in bpe tokenizer
</commit_message>
<xml_diff>
--- a/assignments/assignment1-basics/writeup.docx
+++ b/assignments/assignment1-basics/writeup.docx
@@ -14,7 +14,23 @@
           <w:b/>
           <w:bCs/>
         </w:rPr>
-        <w:t>(a) What Unicode character does chr(0) return?</w:t>
+        <w:t xml:space="preserve">(a) What Unicode character does </w:t>
+      </w:r>
+      <w:proofErr w:type="gramStart"/>
+      <w:r>
+        <w:rPr>
+          <w:b/>
+          <w:bCs/>
+        </w:rPr>
+        <w:t>chr(</w:t>
+      </w:r>
+      <w:proofErr w:type="gramEnd"/>
+      <w:r>
+        <w:rPr>
+          <w:b/>
+          <w:bCs/>
+        </w:rPr>
+        <w:t>0) return?</w:t>
       </w:r>
     </w:p>
     <w:p>
@@ -22,38 +38,107 @@
         <w:t xml:space="preserve"> </w:t>
       </w:r>
       <w:r>
-        <w:t>Answer: Unicode character ‘\x00’  for the code point ‘0’.  Chr(0) represents “no character”, or “absence of character”</w:t>
+        <w:t>Answer: Unicode character ‘\x00</w:t>
+      </w:r>
+      <w:proofErr w:type="gramStart"/>
+      <w:r>
+        <w:t>’  for</w:t>
+      </w:r>
+      <w:proofErr w:type="gramEnd"/>
+      <w:r>
+        <w:t xml:space="preserve"> the code point ‘0’.  </w:t>
+      </w:r>
+      <w:proofErr w:type="gramStart"/>
+      <w:r>
+        <w:t>Chr(</w:t>
+      </w:r>
+      <w:proofErr w:type="gramEnd"/>
+      <w:r>
+        <w:t>0) represents “no character”, or “absence of character”</w:t>
       </w:r>
     </w:p>
     <w:p>
       <w:r>
-        <w:t xml:space="preserve"> (b) How does this character’s string representation (__repr__()) differ from its printed representation?</w:t>
+        <w:t xml:space="preserve"> (b) How does this character’s string representation (__</w:t>
+      </w:r>
+      <w:proofErr w:type="spellStart"/>
+      <w:r>
+        <w:t>repr</w:t>
+      </w:r>
+      <w:proofErr w:type="spellEnd"/>
+      <w:r>
+        <w:t>_</w:t>
+      </w:r>
+      <w:proofErr w:type="gramStart"/>
+      <w:r>
+        <w:t>_(</w:t>
+      </w:r>
+      <w:proofErr w:type="gramEnd"/>
+      <w:r>
+        <w:t>)) differ from its printed representation?</w:t>
       </w:r>
     </w:p>
     <w:p>
       <w:r>
         <w:t xml:space="preserve"> </w:t>
       </w:r>
+      <w:proofErr w:type="gramStart"/>
       <w:r>
         <w:t xml:space="preserve">Answer </w:t>
       </w:r>
       <w:r>
-        <w:t xml:space="preserve">: </w:t>
-      </w:r>
+        <w:t>:</w:t>
+      </w:r>
+      <w:proofErr w:type="gramEnd"/>
       <w:r>
         <w:t xml:space="preserve"> </w:t>
       </w:r>
       <w:r>
+        <w:t xml:space="preserve"> </w:t>
+      </w:r>
+      <w:r>
         <w:t>precise</w:t>
       </w:r>
       <w:r>
-        <w:t xml:space="preserve"> representation is displayed by __repr__() and it outputs machine readable format, print() uses </w:t>
+        <w:t xml:space="preserve"> representation is displayed by __</w:t>
+      </w:r>
+      <w:proofErr w:type="spellStart"/>
+      <w:r>
+        <w:t>repr</w:t>
+      </w:r>
+      <w:proofErr w:type="spellEnd"/>
+      <w:r>
+        <w:t>_</w:t>
+      </w:r>
+      <w:proofErr w:type="gramStart"/>
+      <w:r>
+        <w:t>_(</w:t>
+      </w:r>
+      <w:proofErr w:type="gramEnd"/>
+      <w:r>
+        <w:t xml:space="preserve">) and it outputs machine readable format, </w:t>
+      </w:r>
+      <w:proofErr w:type="gramStart"/>
+      <w:r>
+        <w:t>print(</w:t>
+      </w:r>
+      <w:proofErr w:type="gramEnd"/>
+      <w:r>
+        <w:t xml:space="preserve">) uses </w:t>
       </w:r>
       <w:r>
         <w:t xml:space="preserve">string representation, user friendly format by using </w:t>
       </w:r>
       <w:r>
-        <w:t xml:space="preserve">__str__() and it prints </w:t>
+        <w:t>__str_</w:t>
+      </w:r>
+      <w:proofErr w:type="gramStart"/>
+      <w:r>
+        <w:t>_(</w:t>
+      </w:r>
+      <w:proofErr w:type="gramEnd"/>
+      <w:r>
+        <w:t xml:space="preserve">) and it prints </w:t>
       </w:r>
       <w:r>
         <w:t>nothing</w:t>
@@ -78,7 +163,7 @@
                     <pic:cNvPicPr/>
                   </pic:nvPicPr>
                   <pic:blipFill>
-                    <a:blip r:embed="rId4"/>
+                    <a:blip r:embed="rId5"/>
                     <a:stretch>
                       <a:fillRect/>
                     </a:stretch>
@@ -119,7 +204,7 @@
                     <pic:cNvPicPr/>
                   </pic:nvPicPr>
                   <pic:blipFill>
-                    <a:blip r:embed="rId5"/>
+                    <a:blip r:embed="rId6"/>
                     <a:stretch>
                       <a:fillRect/>
                     </a:stretch>
@@ -142,7 +227,15 @@
     </w:p>
     <w:p>
       <w:r>
-        <w:t>By converting our Unicode codepoints into a sequence of bytes (e.g., via the UTF-8 encoding), we are essentially taking a sequence of codepoints (integers in the range 0 to 154,997) and transforming it into a sequence of byte values (integers in the range 0 to 255). The 256-length byte vocabulary is much more manageable to deal with. When using byte-level tokenization, we do not need to worry about out-of vocabulary tokens, since we know that any input text can be expressed as a sequence of integers from 0 to 255</w:t>
+        <w:t xml:space="preserve">By converting our Unicode codepoints into a sequence of bytes (e.g., via the UTF-8 encoding), we are essentially taking a sequence of codepoints (integers in the range 0 to 154,997) and transforming it into a sequence of byte values (integers in the range 0 to 255). The 256-length byte vocabulary is much more manageable to deal with. When using byte-level tokenization, we do not need to worry about </w:t>
+      </w:r>
+      <w:proofErr w:type="spellStart"/>
+      <w:r>
+        <w:t>out-of</w:t>
+      </w:r>
+      <w:proofErr w:type="spellEnd"/>
+      <w:r>
+        <w:t xml:space="preserve"> vocabulary tokens, since we know that any input text can be expressed as a sequence of integers from 0 to 255</w:t>
       </w:r>
     </w:p>
     <w:p/>
@@ -189,7 +282,7 @@
                     <pic:cNvPicPr/>
                   </pic:nvPicPr>
                   <pic:blipFill>
-                    <a:blip r:embed="rId6"/>
+                    <a:blip r:embed="rId7"/>
                     <a:stretch>
                       <a:fillRect/>
                     </a:stretch>
@@ -223,7 +316,23 @@
           <w:b/>
           <w:bCs/>
         </w:rPr>
-        <w:t>2.3 Subword Tokenization</w:t>
+        <w:t xml:space="preserve">2.3 </w:t>
+      </w:r>
+      <w:proofErr w:type="spellStart"/>
+      <w:r>
+        <w:rPr>
+          <w:b/>
+          <w:bCs/>
+        </w:rPr>
+        <w:t>Subword</w:t>
+      </w:r>
+      <w:proofErr w:type="spellEnd"/>
+      <w:r>
+        <w:rPr>
+          <w:b/>
+          <w:bCs/>
+        </w:rPr>
+        <w:t xml:space="preserve"> Tokenization</w:t>
       </w:r>
       <w:r>
         <w:rPr>
@@ -242,7 +351,23 @@
         <w:t>-</w:t>
       </w:r>
       <w:r>
-        <w:t xml:space="preserve"> While byte-level tokenization can alleviate the out-of-vocabulary issues faced by word-level tokenizers, tok enizing text into bytes results in extremely long input sequences. This slows down model training, since a 5 sentence with 10 words might only be 10 tokens long in a word-level language model, but could be 50 or more tokens long in a character-level model (depending on the length of the words). Processing these longer sequences requires more computation at each step of the model.</w:t>
+        <w:t xml:space="preserve"> While byte-level tokenization can alleviate the out-of-vocabulary issues faced by word-level tokenizers, </w:t>
+      </w:r>
+      <w:proofErr w:type="spellStart"/>
+      <w:r>
+        <w:t>tok</w:t>
+      </w:r>
+      <w:proofErr w:type="spellEnd"/>
+      <w:r>
+        <w:t xml:space="preserve"> </w:t>
+      </w:r>
+      <w:proofErr w:type="spellStart"/>
+      <w:r>
+        <w:t>enizing</w:t>
+      </w:r>
+      <w:proofErr w:type="spellEnd"/>
+      <w:r>
+        <w:t xml:space="preserve"> text into bytes results in extremely long input sequences. This slows down model training, since a 5 sentence with 10 words might only be 10 tokens long in a word-level language model, but could be 50 or more tokens long in a character-level model (depending on the length of the words). Processing these longer sequences requires more computation at each step of the model.</w:t>
       </w:r>
     </w:p>
     <w:p>
@@ -250,7 +375,23 @@
         <w:t xml:space="preserve">- </w:t>
       </w:r>
       <w:r>
-        <w:t>propose to use byte-pair encoding (BPE; Gage, 1994), a compression algorithm that iteratively replaces (“merges”) the most frequent pair of bytes with a single, new unused index. Note that this algorithm adds subword tokens to our vocabulary to maximize the compression of our input sequences—if a word occurs in our input text enough times, it’ll be represented as a single subword unit.</w:t>
+        <w:t xml:space="preserve">propose to use byte-pair encoding (BPE; Gage, 1994), a compression algorithm that iteratively replaces (“merges”) the most frequent pair of bytes with a single, new unused index. Note that this algorithm adds </w:t>
+      </w:r>
+      <w:proofErr w:type="spellStart"/>
+      <w:r>
+        <w:t>subword</w:t>
+      </w:r>
+      <w:proofErr w:type="spellEnd"/>
+      <w:r>
+        <w:t xml:space="preserve"> tokens to our vocabulary to maximize the compression of our input sequences—if a word occurs in our input text enough times, it’ll be represented as a single </w:t>
+      </w:r>
+      <w:proofErr w:type="spellStart"/>
+      <w:r>
+        <w:t>subword</w:t>
+      </w:r>
+      <w:proofErr w:type="spellEnd"/>
+      <w:r>
+        <w:t xml:space="preserve"> unit.</w:t>
       </w:r>
     </w:p>
     <w:p/>
@@ -307,7 +448,25 @@
           <w:b/>
           <w:bCs/>
         </w:rPr>
-        <w:t>however, you should use re.finditer to avoid storing the pre-tokenized words as you construct your mapping from pre-tokens to their counts.</w:t>
+        <w:t xml:space="preserve">however, you should use </w:t>
+      </w:r>
+      <w:proofErr w:type="spellStart"/>
+      <w:proofErr w:type="gramStart"/>
+      <w:r>
+        <w:rPr>
+          <w:b/>
+          <w:bCs/>
+        </w:rPr>
+        <w:t>re.finditer</w:t>
+      </w:r>
+      <w:proofErr w:type="spellEnd"/>
+      <w:proofErr w:type="gramEnd"/>
+      <w:r>
+        <w:rPr>
+          <w:b/>
+          <w:bCs/>
+        </w:rPr>
+        <w:t xml:space="preserve"> to avoid storing the pre-tokenized words as you construct your mapping from pre-tokens to their counts.</w:t>
       </w:r>
     </w:p>
     <w:p>
@@ -508,7 +667,98 @@
           <w:lang w:eastAsia="en-IN"/>
           <w14:ligatures w14:val="none"/>
         </w:rPr>
-        <w:t xml:space="preserve">'(?:[sdmt]|ll|ve|re)| </w:t>
+        <w:t>'</w:t>
+      </w:r>
+      <w:proofErr w:type="gramStart"/>
+      <w:r>
+        <w:rPr>
+          <w:rFonts w:ascii="Consolas" w:eastAsia="Times New Roman" w:hAnsi="Consolas" w:cs="Times New Roman"/>
+          <w:color w:val="D6D6DD"/>
+          <w:kern w:val="0"/>
+          <w:sz w:val="21"/>
+          <w:szCs w:val="21"/>
+          <w:lang w:eastAsia="en-IN"/>
+          <w14:ligatures w14:val="none"/>
+        </w:rPr>
+        <w:t>(?:</w:t>
+      </w:r>
+      <w:proofErr w:type="gramEnd"/>
+      <w:r>
+        <w:rPr>
+          <w:rFonts w:ascii="Consolas" w:eastAsia="Times New Roman" w:hAnsi="Consolas" w:cs="Times New Roman"/>
+          <w:color w:val="D6D6DD"/>
+          <w:kern w:val="0"/>
+          <w:sz w:val="21"/>
+          <w:szCs w:val="21"/>
+          <w:lang w:eastAsia="en-IN"/>
+          <w14:ligatures w14:val="none"/>
+        </w:rPr>
+        <w:t>[</w:t>
+      </w:r>
+      <w:proofErr w:type="spellStart"/>
+      <w:r>
+        <w:rPr>
+          <w:rFonts w:ascii="Consolas" w:eastAsia="Times New Roman" w:hAnsi="Consolas" w:cs="Times New Roman"/>
+          <w:color w:val="D6D6DD"/>
+          <w:kern w:val="0"/>
+          <w:sz w:val="21"/>
+          <w:szCs w:val="21"/>
+          <w:lang w:eastAsia="en-IN"/>
+          <w14:ligatures w14:val="none"/>
+        </w:rPr>
+        <w:t>sdmt</w:t>
+      </w:r>
+      <w:proofErr w:type="spellEnd"/>
+      <w:r>
+        <w:rPr>
+          <w:rFonts w:ascii="Consolas" w:eastAsia="Times New Roman" w:hAnsi="Consolas" w:cs="Times New Roman"/>
+          <w:color w:val="D6D6DD"/>
+          <w:kern w:val="0"/>
+          <w:sz w:val="21"/>
+          <w:szCs w:val="21"/>
+          <w:lang w:eastAsia="en-IN"/>
+          <w14:ligatures w14:val="none"/>
+        </w:rPr>
+        <w:t>]|</w:t>
+      </w:r>
+      <w:proofErr w:type="spellStart"/>
+      <w:r>
+        <w:rPr>
+          <w:rFonts w:ascii="Consolas" w:eastAsia="Times New Roman" w:hAnsi="Consolas" w:cs="Times New Roman"/>
+          <w:color w:val="D6D6DD"/>
+          <w:kern w:val="0"/>
+          <w:sz w:val="21"/>
+          <w:szCs w:val="21"/>
+          <w:lang w:eastAsia="en-IN"/>
+          <w14:ligatures w14:val="none"/>
+        </w:rPr>
+        <w:t>ll|ve|</w:t>
+      </w:r>
+      <w:proofErr w:type="gramStart"/>
+      <w:r>
+        <w:rPr>
+          <w:rFonts w:ascii="Consolas" w:eastAsia="Times New Roman" w:hAnsi="Consolas" w:cs="Times New Roman"/>
+          <w:color w:val="D6D6DD"/>
+          <w:kern w:val="0"/>
+          <w:sz w:val="21"/>
+          <w:szCs w:val="21"/>
+          <w:lang w:eastAsia="en-IN"/>
+          <w14:ligatures w14:val="none"/>
+        </w:rPr>
+        <w:t>re</w:t>
+      </w:r>
+      <w:proofErr w:type="spellEnd"/>
+      <w:r>
+        <w:rPr>
+          <w:rFonts w:ascii="Consolas" w:eastAsia="Times New Roman" w:hAnsi="Consolas" w:cs="Times New Roman"/>
+          <w:color w:val="D6D6DD"/>
+          <w:kern w:val="0"/>
+          <w:sz w:val="21"/>
+          <w:szCs w:val="21"/>
+          <w:lang w:eastAsia="en-IN"/>
+          <w14:ligatures w14:val="none"/>
+        </w:rPr>
+        <w:t xml:space="preserve">)| </w:t>
       </w:r>
       <w:r>
         <w:rPr>
@@ -532,7 +782,20 @@
           <w:lang w:eastAsia="en-IN"/>
           <w14:ligatures w14:val="none"/>
         </w:rPr>
-        <w:t>\p{L}</w:t>
+        <w:t>\</w:t>
+      </w:r>
+      <w:proofErr w:type="gramEnd"/>
+      <w:r>
+        <w:rPr>
+          <w:rFonts w:ascii="Consolas" w:eastAsia="Times New Roman" w:hAnsi="Consolas" w:cs="Times New Roman"/>
+          <w:color w:val="D6D6DD"/>
+          <w:kern w:val="0"/>
+          <w:sz w:val="21"/>
+          <w:szCs w:val="21"/>
+          <w:lang w:eastAsia="en-IN"/>
+          <w14:ligatures w14:val="none"/>
+        </w:rPr>
+        <w:t>p{L}</w:t>
       </w:r>
       <w:r>
         <w:rPr>
@@ -546,6 +809,7 @@
         </w:rPr>
         <w:t>+</w:t>
       </w:r>
+      <w:proofErr w:type="gramStart"/>
       <w:r>
         <w:rPr>
           <w:rFonts w:ascii="Consolas" w:eastAsia="Times New Roman" w:hAnsi="Consolas" w:cs="Times New Roman"/>
@@ -570,6 +834,7 @@
         </w:rPr>
         <w:t>?</w:t>
       </w:r>
+      <w:proofErr w:type="gramEnd"/>
       <w:r>
         <w:rPr>
           <w:rFonts w:ascii="Consolas" w:eastAsia="Times New Roman" w:hAnsi="Consolas" w:cs="Times New Roman"/>
@@ -594,6 +859,7 @@
         </w:rPr>
         <w:t>+</w:t>
       </w:r>
+      <w:proofErr w:type="gramStart"/>
       <w:r>
         <w:rPr>
           <w:rFonts w:ascii="Consolas" w:eastAsia="Times New Roman" w:hAnsi="Consolas" w:cs="Times New Roman"/>
@@ -618,17 +884,31 @@
         </w:rPr>
         <w:t>?</w:t>
       </w:r>
-      <w:r>
-        <w:rPr>
-          <w:rFonts w:ascii="Consolas" w:eastAsia="Times New Roman" w:hAnsi="Consolas" w:cs="Times New Roman"/>
-          <w:color w:val="D6D6DD"/>
-          <w:kern w:val="0"/>
-          <w:sz w:val="21"/>
-          <w:szCs w:val="21"/>
-          <w:lang w:eastAsia="en-IN"/>
-          <w14:ligatures w14:val="none"/>
-        </w:rPr>
-        <w:t>[^\s\p{L}\p{N}]</w:t>
+      <w:proofErr w:type="gramEnd"/>
+      <w:r>
+        <w:rPr>
+          <w:rFonts w:ascii="Consolas" w:eastAsia="Times New Roman" w:hAnsi="Consolas" w:cs="Times New Roman"/>
+          <w:color w:val="D6D6DD"/>
+          <w:kern w:val="0"/>
+          <w:sz w:val="21"/>
+          <w:szCs w:val="21"/>
+          <w:lang w:eastAsia="en-IN"/>
+          <w14:ligatures w14:val="none"/>
+        </w:rPr>
+        <w:t>[^\s\p{L}\p{N</w:t>
+      </w:r>
+      <w:proofErr w:type="gramStart"/>
+      <w:r>
+        <w:rPr>
+          <w:rFonts w:ascii="Consolas" w:eastAsia="Times New Roman" w:hAnsi="Consolas" w:cs="Times New Roman"/>
+          <w:color w:val="D6D6DD"/>
+          <w:kern w:val="0"/>
+          <w:sz w:val="21"/>
+          <w:szCs w:val="21"/>
+          <w:lang w:eastAsia="en-IN"/>
+          <w14:ligatures w14:val="none"/>
+        </w:rPr>
+        <w:t>}]</w:t>
       </w:r>
       <w:r>
         <w:rPr>
@@ -642,6 +922,7 @@
         </w:rPr>
         <w:t>+</w:t>
       </w:r>
+      <w:proofErr w:type="gramEnd"/>
       <w:r>
         <w:rPr>
           <w:rFonts w:ascii="Consolas" w:eastAsia="Times New Roman" w:hAnsi="Consolas" w:cs="Times New Roman"/>
@@ -676,7 +957,33 @@
           <w:lang w:eastAsia="en-IN"/>
           <w14:ligatures w14:val="none"/>
         </w:rPr>
-        <w:t>(?!\S)|\s</w:t>
+        <w:t>(?!\</w:t>
+      </w:r>
+      <w:proofErr w:type="gramStart"/>
+      <w:r>
+        <w:rPr>
+          <w:rFonts w:ascii="Consolas" w:eastAsia="Times New Roman" w:hAnsi="Consolas" w:cs="Times New Roman"/>
+          <w:color w:val="D6D6DD"/>
+          <w:kern w:val="0"/>
+          <w:sz w:val="21"/>
+          <w:szCs w:val="21"/>
+          <w:lang w:eastAsia="en-IN"/>
+          <w14:ligatures w14:val="none"/>
+        </w:rPr>
+        <w:t>S)|</w:t>
+      </w:r>
+      <w:proofErr w:type="gramEnd"/>
+      <w:r>
+        <w:rPr>
+          <w:rFonts w:ascii="Consolas" w:eastAsia="Times New Roman" w:hAnsi="Consolas" w:cs="Times New Roman"/>
+          <w:color w:val="D6D6DD"/>
+          <w:kern w:val="0"/>
+          <w:sz w:val="21"/>
+          <w:szCs w:val="21"/>
+          <w:lang w:eastAsia="en-IN"/>
+          <w14:ligatures w14:val="none"/>
+        </w:rPr>
+        <w:t>\s</w:t>
       </w:r>
       <w:r>
         <w:rPr>
@@ -756,6 +1063,8 @@
         </w:rPr>
         <w:t>=</w:t>
       </w:r>
+      <w:proofErr w:type="spellStart"/>
+      <w:proofErr w:type="gramStart"/>
       <w:r>
         <w:rPr>
           <w:rFonts w:ascii="Consolas" w:eastAsia="Times New Roman" w:hAnsi="Consolas" w:cs="Times New Roman"/>
@@ -792,6 +1101,8 @@
         </w:rPr>
         <w:t>findall</w:t>
       </w:r>
+      <w:proofErr w:type="spellEnd"/>
+      <w:proofErr w:type="gramEnd"/>
       <w:r>
         <w:rPr>
           <w:rFonts w:ascii="Consolas" w:eastAsia="Times New Roman" w:hAnsi="Consolas" w:cs="Times New Roman"/>
@@ -804,6 +1115,7 @@
         </w:rPr>
         <w:t>(</w:t>
       </w:r>
+      <w:proofErr w:type="spellStart"/>
       <w:r>
         <w:rPr>
           <w:rFonts w:ascii="Consolas" w:eastAsia="Times New Roman" w:hAnsi="Consolas" w:cs="Times New Roman"/>
@@ -838,7 +1150,46 @@
           <w:lang w:eastAsia="en-IN"/>
           <w14:ligatures w14:val="none"/>
         </w:rPr>
-        <w:t>"some text that i'll pre-tokenize"</w:t>
+        <w:t>"some</w:t>
+      </w:r>
+      <w:proofErr w:type="spellEnd"/>
+      <w:r>
+        <w:rPr>
+          <w:rFonts w:ascii="Consolas" w:eastAsia="Times New Roman" w:hAnsi="Consolas" w:cs="Times New Roman"/>
+          <w:color w:val="E394DC"/>
+          <w:kern w:val="0"/>
+          <w:sz w:val="21"/>
+          <w:szCs w:val="21"/>
+          <w:lang w:eastAsia="en-IN"/>
+          <w14:ligatures w14:val="none"/>
+        </w:rPr>
+        <w:t xml:space="preserve"> text that </w:t>
+      </w:r>
+      <w:proofErr w:type="spellStart"/>
+      <w:r>
+        <w:rPr>
+          <w:rFonts w:ascii="Consolas" w:eastAsia="Times New Roman" w:hAnsi="Consolas" w:cs="Times New Roman"/>
+          <w:color w:val="E394DC"/>
+          <w:kern w:val="0"/>
+          <w:sz w:val="21"/>
+          <w:szCs w:val="21"/>
+          <w:lang w:eastAsia="en-IN"/>
+          <w14:ligatures w14:val="none"/>
+        </w:rPr>
+        <w:t>i'll</w:t>
+      </w:r>
+      <w:proofErr w:type="spellEnd"/>
+      <w:r>
+        <w:rPr>
+          <w:rFonts w:ascii="Consolas" w:eastAsia="Times New Roman" w:hAnsi="Consolas" w:cs="Times New Roman"/>
+          <w:color w:val="E394DC"/>
+          <w:kern w:val="0"/>
+          <w:sz w:val="21"/>
+          <w:szCs w:val="21"/>
+          <w:lang w:eastAsia="en-IN"/>
+          <w14:ligatures w14:val="none"/>
+        </w:rPr>
+        <w:t xml:space="preserve"> pre-tokenize"</w:t>
       </w:r>
       <w:r>
         <w:rPr>
@@ -993,6 +1344,8 @@
         </w:rPr>
         <w:t xml:space="preserve"> </w:t>
       </w:r>
+      <w:proofErr w:type="spellStart"/>
+      <w:proofErr w:type="gramStart"/>
       <w:r>
         <w:rPr>
           <w:rFonts w:ascii="Consolas" w:eastAsia="Times New Roman" w:hAnsi="Consolas" w:cs="Times New Roman"/>
@@ -1029,6 +1382,8 @@
         </w:rPr>
         <w:t>finditer</w:t>
       </w:r>
+      <w:proofErr w:type="spellEnd"/>
+      <w:proofErr w:type="gramEnd"/>
       <w:r>
         <w:rPr>
           <w:rFonts w:ascii="Consolas" w:eastAsia="Times New Roman" w:hAnsi="Consolas" w:cs="Times New Roman"/>
@@ -1041,6 +1396,7 @@
         </w:rPr>
         <w:t>(</w:t>
       </w:r>
+      <w:proofErr w:type="spellStart"/>
       <w:r>
         <w:rPr>
           <w:rFonts w:ascii="Consolas" w:eastAsia="Times New Roman" w:hAnsi="Consolas" w:cs="Times New Roman"/>
@@ -1075,7 +1431,46 @@
           <w:lang w:eastAsia="en-IN"/>
           <w14:ligatures w14:val="none"/>
         </w:rPr>
-        <w:t>"some text that i'll pre-tokenize"</w:t>
+        <w:t>"some</w:t>
+      </w:r>
+      <w:proofErr w:type="spellEnd"/>
+      <w:r>
+        <w:rPr>
+          <w:rFonts w:ascii="Consolas" w:eastAsia="Times New Roman" w:hAnsi="Consolas" w:cs="Times New Roman"/>
+          <w:color w:val="E394DC"/>
+          <w:kern w:val="0"/>
+          <w:sz w:val="21"/>
+          <w:szCs w:val="21"/>
+          <w:lang w:eastAsia="en-IN"/>
+          <w14:ligatures w14:val="none"/>
+        </w:rPr>
+        <w:t xml:space="preserve"> text that </w:t>
+      </w:r>
+      <w:proofErr w:type="spellStart"/>
+      <w:r>
+        <w:rPr>
+          <w:rFonts w:ascii="Consolas" w:eastAsia="Times New Roman" w:hAnsi="Consolas" w:cs="Times New Roman"/>
+          <w:color w:val="E394DC"/>
+          <w:kern w:val="0"/>
+          <w:sz w:val="21"/>
+          <w:szCs w:val="21"/>
+          <w:lang w:eastAsia="en-IN"/>
+          <w14:ligatures w14:val="none"/>
+        </w:rPr>
+        <w:t>i'll</w:t>
+      </w:r>
+      <w:proofErr w:type="spellEnd"/>
+      <w:r>
+        <w:rPr>
+          <w:rFonts w:ascii="Consolas" w:eastAsia="Times New Roman" w:hAnsi="Consolas" w:cs="Times New Roman"/>
+          <w:color w:val="E394DC"/>
+          <w:kern w:val="0"/>
+          <w:sz w:val="21"/>
+          <w:szCs w:val="21"/>
+          <w:lang w:eastAsia="en-IN"/>
+          <w14:ligatures w14:val="none"/>
+        </w:rPr>
+        <w:t xml:space="preserve"> pre-tokenize"</w:t>
       </w:r>
       <w:r>
         <w:rPr>
@@ -1270,6 +1665,8 @@
         </w:rPr>
         <w:t>(</w:t>
       </w:r>
+      <w:proofErr w:type="spellStart"/>
+      <w:proofErr w:type="gramStart"/>
       <w:r>
         <w:rPr>
           <w:rFonts w:ascii="Consolas" w:eastAsia="Times New Roman" w:hAnsi="Consolas" w:cs="Times New Roman"/>
@@ -1306,17 +1703,32 @@
         </w:rPr>
         <w:t>group</w:t>
       </w:r>
-      <w:r>
-        <w:rPr>
-          <w:rFonts w:ascii="Consolas" w:eastAsia="Times New Roman" w:hAnsi="Consolas" w:cs="Times New Roman"/>
-          <w:color w:val="D6D6DD"/>
-          <w:kern w:val="0"/>
-          <w:sz w:val="21"/>
-          <w:szCs w:val="21"/>
-          <w:lang w:eastAsia="en-IN"/>
-          <w14:ligatures w14:val="none"/>
-        </w:rPr>
-        <w:t>(),</w:t>
+      <w:proofErr w:type="spellEnd"/>
+      <w:proofErr w:type="gramEnd"/>
+      <w:r>
+        <w:rPr>
+          <w:rFonts w:ascii="Consolas" w:eastAsia="Times New Roman" w:hAnsi="Consolas" w:cs="Times New Roman"/>
+          <w:color w:val="D6D6DD"/>
+          <w:kern w:val="0"/>
+          <w:sz w:val="21"/>
+          <w:szCs w:val="21"/>
+          <w:lang w:eastAsia="en-IN"/>
+          <w14:ligatures w14:val="none"/>
+        </w:rPr>
+        <w:t>(</w:t>
+      </w:r>
+      <w:proofErr w:type="gramStart"/>
+      <w:r>
+        <w:rPr>
+          <w:rFonts w:ascii="Consolas" w:eastAsia="Times New Roman" w:hAnsi="Consolas" w:cs="Times New Roman"/>
+          <w:color w:val="D6D6DD"/>
+          <w:kern w:val="0"/>
+          <w:sz w:val="21"/>
+          <w:szCs w:val="21"/>
+          <w:lang w:eastAsia="en-IN"/>
+          <w14:ligatures w14:val="none"/>
+        </w:rPr>
+        <w:t>),</w:t>
       </w:r>
       <w:r>
         <w:rPr>
@@ -1332,6 +1744,7 @@
         </w:rPr>
         <w:t>end</w:t>
       </w:r>
+      <w:proofErr w:type="gramEnd"/>
       <w:r>
         <w:rPr>
           <w:rFonts w:ascii="Consolas" w:eastAsia="Times New Roman" w:hAnsi="Consolas" w:cs="Times New Roman"/>
@@ -1383,6 +1796,7 @@
           <w14:ligatures w14:val="none"/>
         </w:rPr>
       </w:pPr>
+      <w:proofErr w:type="gramStart"/>
       <w:r>
         <w:rPr>
           <w:rFonts w:ascii="Consolas" w:eastAsia="Times New Roman" w:hAnsi="Consolas" w:cs="Times New Roman"/>
@@ -1405,7 +1819,20 @@
           <w:lang w:eastAsia="en-IN"/>
           <w14:ligatures w14:val="none"/>
         </w:rPr>
-        <w:t>()</w:t>
+        <w:t>(</w:t>
+      </w:r>
+      <w:proofErr w:type="gramEnd"/>
+      <w:r>
+        <w:rPr>
+          <w:rFonts w:ascii="Consolas" w:eastAsia="Times New Roman" w:hAnsi="Consolas" w:cs="Times New Roman"/>
+          <w:color w:val="D6D6DD"/>
+          <w:kern w:val="0"/>
+          <w:sz w:val="21"/>
+          <w:szCs w:val="21"/>
+          <w:lang w:eastAsia="en-IN"/>
+          <w14:ligatures w14:val="none"/>
+        </w:rPr>
+        <w:t>)</w:t>
       </w:r>
     </w:p>
     <w:p>
@@ -1437,6 +1864,7 @@
           <w14:ligatures w14:val="none"/>
         </w:rPr>
       </w:pPr>
+      <w:proofErr w:type="spellStart"/>
       <w:r>
         <w:rPr>
           <w:rFonts w:ascii="Consolas" w:eastAsia="Times New Roman" w:hAnsi="Consolas" w:cs="Times New Roman"/>
@@ -1449,6 +1877,7 @@
         </w:rPr>
         <w:t>greatest_pair</w:t>
       </w:r>
+      <w:proofErr w:type="spellEnd"/>
       <w:r>
         <w:rPr>
           <w:rFonts w:ascii="Consolas" w:eastAsia="Times New Roman" w:hAnsi="Consolas" w:cs="Times New Roman"/>
@@ -1473,6 +1902,7 @@
         </w:rPr>
         <w:t xml:space="preserve"> </w:t>
       </w:r>
+      <w:proofErr w:type="gramStart"/>
       <w:r>
         <w:rPr>
           <w:rFonts w:ascii="Consolas" w:eastAsia="Times New Roman" w:hAnsi="Consolas" w:cs="Times New Roman"/>
@@ -1495,7 +1925,20 @@
           <w:lang w:eastAsia="en-IN"/>
           <w14:ligatures w14:val="none"/>
         </w:rPr>
-        <w:t>([(</w:t>
+        <w:t>(</w:t>
+      </w:r>
+      <w:proofErr w:type="gramEnd"/>
+      <w:r>
+        <w:rPr>
+          <w:rFonts w:ascii="Consolas" w:eastAsia="Times New Roman" w:hAnsi="Consolas" w:cs="Times New Roman"/>
+          <w:color w:val="D6D6DD"/>
+          <w:kern w:val="0"/>
+          <w:sz w:val="21"/>
+          <w:szCs w:val="21"/>
+          <w:lang w:eastAsia="en-IN"/>
+          <w14:ligatures w14:val="none"/>
+        </w:rPr>
+        <w:t>[(</w:t>
       </w:r>
       <w:r>
         <w:rPr>
@@ -1836,6 +2279,7 @@
           <w14:ligatures w14:val="none"/>
         </w:rPr>
       </w:pPr>
+      <w:proofErr w:type="gramStart"/>
       <w:r>
         <w:rPr>
           <w:rFonts w:ascii="Consolas" w:eastAsia="Times New Roman" w:hAnsi="Consolas" w:cs="Times New Roman"/>
@@ -1860,6 +2304,8 @@
         </w:rPr>
         <w:t>(</w:t>
       </w:r>
+      <w:proofErr w:type="spellStart"/>
+      <w:proofErr w:type="gramEnd"/>
       <w:r>
         <w:rPr>
           <w:rFonts w:ascii="Consolas" w:eastAsia="Times New Roman" w:hAnsi="Consolas" w:cs="Times New Roman"/>
@@ -1882,7 +2328,20 @@
           <w:lang w:eastAsia="en-IN"/>
           <w14:ligatures w14:val="none"/>
         </w:rPr>
-        <w:t xml:space="preserve">"greatest_pair is </w:t>
+        <w:t>"greatest_pair</w:t>
+      </w:r>
+      <w:proofErr w:type="spellEnd"/>
+      <w:r>
+        <w:rPr>
+          <w:rFonts w:ascii="Consolas" w:eastAsia="Times New Roman" w:hAnsi="Consolas" w:cs="Times New Roman"/>
+          <w:color w:val="E394DC"/>
+          <w:kern w:val="0"/>
+          <w:sz w:val="21"/>
+          <w:szCs w:val="21"/>
+          <w:lang w:eastAsia="en-IN"/>
+          <w14:ligatures w14:val="none"/>
+        </w:rPr>
+        <w:t xml:space="preserve"> is </w:t>
       </w:r>
       <w:r>
         <w:rPr>
@@ -1896,6 +2355,7 @@
         </w:rPr>
         <w:t>{</w:t>
       </w:r>
+      <w:proofErr w:type="spellStart"/>
       <w:r>
         <w:rPr>
           <w:rFonts w:ascii="Consolas" w:eastAsia="Times New Roman" w:hAnsi="Consolas" w:cs="Times New Roman"/>
@@ -1908,6 +2368,7 @@
         </w:rPr>
         <w:t>greatest_pair</w:t>
       </w:r>
+      <w:proofErr w:type="spellEnd"/>
       <w:r>
         <w:rPr>
           <w:rFonts w:ascii="Consolas" w:eastAsia="Times New Roman" w:hAnsi="Consolas" w:cs="Times New Roman"/>
@@ -1973,7 +2434,7 @@
                     <pic:cNvPicPr/>
                   </pic:nvPicPr>
                   <pic:blipFill>
-                    <a:blip r:embed="rId7"/>
+                    <a:blip r:embed="rId8"/>
                     <a:stretch>
                       <a:fillRect/>
                     </a:stretch>
@@ -1994,6 +2455,255 @@
         </w:drawing>
       </w:r>
     </w:p>
+    <w:p>
+      <w:pPr>
+        <w:rPr>
+          <w:b/>
+          <w:bCs/>
+        </w:rPr>
+      </w:pPr>
+      <w:r>
+        <w:rPr>
+          <w:b/>
+          <w:bCs/>
+        </w:rPr>
+        <w:t>(b) Consider the following (incorrect) function, which is intended to decode a UTF-</w:t>
+      </w:r>
+      <w:proofErr w:type="gramStart"/>
+      <w:r>
+        <w:rPr>
+          <w:b/>
+          <w:bCs/>
+        </w:rPr>
+        <w:t>8 byte</w:t>
+      </w:r>
+      <w:proofErr w:type="gramEnd"/>
+      <w:r>
+        <w:rPr>
+          <w:b/>
+          <w:bCs/>
+        </w:rPr>
+        <w:t xml:space="preserve"> string into a Unicode string. Why is this function incorrect? Provide an example of an input byte string that yields incorrect results. def decode_utf8_bytes_to_str_</w:t>
+      </w:r>
+      <w:proofErr w:type="gramStart"/>
+      <w:r>
+        <w:rPr>
+          <w:b/>
+          <w:bCs/>
+        </w:rPr>
+        <w:t>wrong(</w:t>
+      </w:r>
+      <w:proofErr w:type="spellStart"/>
+      <w:proofErr w:type="gramEnd"/>
+      <w:r>
+        <w:rPr>
+          <w:b/>
+          <w:bCs/>
+        </w:rPr>
+        <w:t>bytestring</w:t>
+      </w:r>
+      <w:proofErr w:type="spellEnd"/>
+      <w:r>
+        <w:rPr>
+          <w:b/>
+          <w:bCs/>
+        </w:rPr>
+        <w:t>: bytes): return "</w:t>
+      </w:r>
+      <w:proofErr w:type="gramStart"/>
+      <w:r>
+        <w:rPr>
+          <w:b/>
+          <w:bCs/>
+        </w:rPr>
+        <w:t>".join</w:t>
+      </w:r>
+      <w:proofErr w:type="gramEnd"/>
+      <w:r>
+        <w:rPr>
+          <w:b/>
+          <w:bCs/>
+        </w:rPr>
+        <w:t>([bytes([b]</w:t>
+      </w:r>
+      <w:proofErr w:type="gramStart"/>
+      <w:r>
+        <w:rPr>
+          <w:b/>
+          <w:bCs/>
+        </w:rPr>
+        <w:t>).decode</w:t>
+      </w:r>
+      <w:proofErr w:type="gramEnd"/>
+      <w:r>
+        <w:rPr>
+          <w:b/>
+          <w:bCs/>
+        </w:rPr>
+        <w:t xml:space="preserve">("utf-8") for b in </w:t>
+      </w:r>
+      <w:proofErr w:type="spellStart"/>
+      <w:r>
+        <w:rPr>
+          <w:b/>
+          <w:bCs/>
+        </w:rPr>
+        <w:t>bytestring</w:t>
+      </w:r>
+      <w:proofErr w:type="spellEnd"/>
+      <w:r>
+        <w:rPr>
+          <w:b/>
+          <w:bCs/>
+        </w:rPr>
+        <w:t>]) &gt;&gt;&gt; decode_utf8_bytes_to_str_wrong("</w:t>
+      </w:r>
+      <w:proofErr w:type="spellStart"/>
+      <w:r>
+        <w:rPr>
+          <w:b/>
+          <w:bCs/>
+        </w:rPr>
+        <w:t>hello</w:t>
+      </w:r>
+      <w:proofErr w:type="gramStart"/>
+      <w:r>
+        <w:rPr>
+          <w:b/>
+          <w:bCs/>
+        </w:rPr>
+        <w:t>".encode</w:t>
+      </w:r>
+      <w:proofErr w:type="spellEnd"/>
+      <w:proofErr w:type="gramEnd"/>
+      <w:r>
+        <w:rPr>
+          <w:b/>
+          <w:bCs/>
+        </w:rPr>
+        <w:t>("utf-8")) 'hello'</w:t>
+      </w:r>
+    </w:p>
+    <w:p>
+      <w:pPr>
+        <w:rPr>
+          <w:b/>
+          <w:bCs/>
+        </w:rPr>
+      </w:pPr>
+    </w:p>
+    <w:p>
+      <w:r>
+        <w:t>It breaks multi-byte characters because UTF-8 decoding must be done on the entire sequence at once, not byte-by-byte.</w:t>
+      </w:r>
+      <w:r>
+        <w:t xml:space="preserve"> </w:t>
+      </w:r>
+      <w:r>
+        <w:t xml:space="preserve">Characters like </w:t>
+      </w:r>
+      <w:r>
+        <w:rPr>
+          <w:b/>
+          <w:bCs/>
+        </w:rPr>
+        <w:t>ż ó ł ć ę ś ń</w:t>
+      </w:r>
+      <w:r>
+        <w:t xml:space="preserve"> are not one byte. They rely on pairs of bytes working together. function tears them apart and tries to decode the pieces like they’re complete </w:t>
+      </w:r>
+      <w:proofErr w:type="spellStart"/>
+      <w:proofErr w:type="gramStart"/>
+      <w:r>
+        <w:t>characters.So</w:t>
+      </w:r>
+      <w:proofErr w:type="spellEnd"/>
+      <w:proofErr w:type="gramEnd"/>
+      <w:r>
+        <w:t xml:space="preserve"> the bug doesn’t show up with simple ASCII. It shows up once any language dares to step beyond the English alphabet</w:t>
+      </w:r>
+    </w:p>
+    <w:p/>
+    <w:p>
+      <w:pPr>
+        <w:rPr>
+          <w:b/>
+          <w:bCs/>
+        </w:rPr>
+      </w:pPr>
+      <w:r>
+        <w:rPr>
+          <w:b/>
+          <w:bCs/>
+        </w:rPr>
+        <w:t xml:space="preserve">(c) Give a </w:t>
+      </w:r>
+      <w:proofErr w:type="gramStart"/>
+      <w:r>
+        <w:rPr>
+          <w:b/>
+          <w:bCs/>
+        </w:rPr>
+        <w:t>two byte</w:t>
+      </w:r>
+      <w:proofErr w:type="gramEnd"/>
+      <w:r>
+        <w:rPr>
+          <w:b/>
+          <w:bCs/>
+        </w:rPr>
+        <w:t xml:space="preserve"> sequence that does not decode to any Unicode character(s)</w:t>
+      </w:r>
+    </w:p>
+    <w:p>
+      <w:pPr>
+        <w:numPr>
+          <w:ilvl w:val="0"/>
+          <w:numId w:val="1"/>
+        </w:numPr>
+      </w:pPr>
+      <w:r>
+        <w:t>0xC2 = 11000010 (8 bits)</w:t>
+      </w:r>
+    </w:p>
+    <w:p>
+      <w:pPr>
+        <w:numPr>
+          <w:ilvl w:val="0"/>
+          <w:numId w:val="1"/>
+        </w:numPr>
+      </w:pPr>
+      <w:r>
+        <w:t xml:space="preserve">The leading 110 tells UTF-8: wait, this should be a </w:t>
+      </w:r>
+      <w:r>
+        <w:rPr>
+          <w:b/>
+          <w:bCs/>
+        </w:rPr>
+        <w:t>2-byte</w:t>
+      </w:r>
+      <w:r>
+        <w:t xml:space="preserve"> character</w:t>
+      </w:r>
+    </w:p>
+    <w:p>
+      <w:pPr>
+        <w:numPr>
+          <w:ilvl w:val="0"/>
+          <w:numId w:val="1"/>
+        </w:numPr>
+      </w:pPr>
+      <w:r>
+        <w:t>If the next byte isn’t of the form 10xxxxxx, decoding breaks</w:t>
+      </w:r>
+    </w:p>
+    <w:p>
+      <w:r>
+        <w:t>That’s why a lone 0xC2 or a bad pair like 0xC2 0x20 fails to produce any Unicode character.</w:t>
+      </w:r>
+    </w:p>
+    <w:p/>
     <w:sectPr>
       <w:pgSz w:w="11906" w:h="16838"/>
       <w:pgMar w:top="1440" w:right="1440" w:bottom="1440" w:left="1440" w:header="708" w:footer="708" w:gutter="0"/>
@@ -2002,6 +2712,163 @@
     </w:sectPr>
   </w:body>
 </w:document>
+</file>
+
+<file path=word/numbering.xml><?xml version="1.0" encoding="utf-8"?>
+<w:numbering xmlns:wpc="http://schemas.microsoft.com/office/word/2010/wordprocessingCanvas" xmlns:cx="http://schemas.microsoft.com/office/drawing/2014/chartex" xmlns:cx1="http://schemas.microsoft.com/office/drawing/2015/9/8/chartex" xmlns:cx2="http://schemas.microsoft.com/office/drawing/2015/10/21/chartex" xmlns:cx3="http://schemas.microsoft.com/office/drawing/2016/5/9/chartex" xmlns:cx4="http://schemas.microsoft.com/office/drawing/2016/5/10/chartex" xmlns:cx5="http://schemas.microsoft.com/office/drawing/2016/5/11/chartex" xmlns:cx6="http://schemas.microsoft.com/office/drawing/2016/5/12/chartex" xmlns:cx7="http://schemas.microsoft.com/office/drawing/2016/5/13/chartex" xmlns:cx8="http://schemas.microsoft.com/office/drawing/2016/5/14/chartex" xmlns:mc="http://schemas.openxmlformats.org/markup-compatibility/2006" xmlns:aink="http://schemas.microsoft.com/office/drawing/2016/ink" xmlns:am3d="http://schemas.microsoft.com/office/drawing/2017/model3d" xmlns:o="urn:schemas-microsoft-com:office:office" xmlns:oel="http://schemas.microsoft.com/office/2019/extlst" xmlns:r="http://schemas.openxmlformats.org/officeDocument/2006/relationships" xmlns:m="http://schemas.openxmlformats.org/officeDocument/2006/math" xmlns:v="urn:schemas-microsoft-com:vml" xmlns:wp14="http://schemas.microsoft.com/office/word/2010/wordprocessingDrawing" xmlns:wp="http://schemas.openxmlformats.org/drawingml/2006/wordprocessingDrawing" xmlns:w10="urn:schemas-microsoft-com:office:word" xmlns:w="http://schemas.openxmlformats.org/wordprocessingml/2006/main" xmlns:w14="http://schemas.microsoft.com/office/word/2010/wordml" xmlns:w15="http://schemas.microsoft.com/office/word/2012/wordml" xmlns:w16cex="http://schemas.microsoft.com/office/word/2018/wordml/cex" xmlns:w16cid="http://schemas.microsoft.com/office/word/2016/wordml/cid" xmlns:w16="http://schemas.microsoft.com/office/word/2018/wordml" xmlns:w16du="http://schemas.microsoft.com/office/word/2023/wordml/word16du" xmlns:w16sdtdh="http://schemas.microsoft.com/office/word/2020/wordml/sdtdatahash" xmlns:w16sdtfl="http://schemas.microsoft.com/office/word/2024/wordml/sdtformatlock" xmlns:w16se="http://schemas.microsoft.com/office/word/2015/wordml/symex" xmlns:wpg="http://schemas.microsoft.com/office/word/2010/wordprocessingGroup" xmlns:wpi="http://schemas.microsoft.com/office/word/2010/wordprocessingInk" xmlns:wne="http://schemas.microsoft.com/office/word/2006/wordml" xmlns:wps="http://schemas.microsoft.com/office/word/2010/wordprocessingShape" mc:Ignorable="w14 w15 w16se w16cid w16 w16cex w16sdtdh w16sdtfl w16du wp14">
+  <w:abstractNum w:abstractNumId="0" w15:restartNumberingAfterBreak="0">
+    <w:nsid w:val="16E46788"/>
+    <w:multiLevelType w:val="multilevel"/>
+    <w:tmpl w:val="443619E0"/>
+    <w:lvl w:ilvl="0">
+      <w:start w:val="1"/>
+      <w:numFmt w:val="bullet"/>
+      <w:lvlText w:val=""/>
+      <w:lvlJc w:val="left"/>
+      <w:pPr>
+        <w:tabs>
+          <w:tab w:val="num" w:pos="720"/>
+        </w:tabs>
+        <w:ind w:left="720" w:hanging="360"/>
+      </w:pPr>
+      <w:rPr>
+        <w:rFonts w:ascii="Symbol" w:hAnsi="Symbol" w:hint="default"/>
+        <w:sz w:val="20"/>
+      </w:rPr>
+    </w:lvl>
+    <w:lvl w:ilvl="1" w:tentative="1">
+      <w:start w:val="1"/>
+      <w:numFmt w:val="bullet"/>
+      <w:lvlText w:val="o"/>
+      <w:lvlJc w:val="left"/>
+      <w:pPr>
+        <w:tabs>
+          <w:tab w:val="num" w:pos="1440"/>
+        </w:tabs>
+        <w:ind w:left="1440" w:hanging="360"/>
+      </w:pPr>
+      <w:rPr>
+        <w:rFonts w:ascii="Courier New" w:hAnsi="Courier New" w:hint="default"/>
+        <w:sz w:val="20"/>
+      </w:rPr>
+    </w:lvl>
+    <w:lvl w:ilvl="2" w:tentative="1">
+      <w:start w:val="1"/>
+      <w:numFmt w:val="bullet"/>
+      <w:lvlText w:val=""/>
+      <w:lvlJc w:val="left"/>
+      <w:pPr>
+        <w:tabs>
+          <w:tab w:val="num" w:pos="2160"/>
+        </w:tabs>
+        <w:ind w:left="2160" w:hanging="360"/>
+      </w:pPr>
+      <w:rPr>
+        <w:rFonts w:ascii="Wingdings" w:hAnsi="Wingdings" w:hint="default"/>
+        <w:sz w:val="20"/>
+      </w:rPr>
+    </w:lvl>
+    <w:lvl w:ilvl="3" w:tentative="1">
+      <w:start w:val="1"/>
+      <w:numFmt w:val="bullet"/>
+      <w:lvlText w:val=""/>
+      <w:lvlJc w:val="left"/>
+      <w:pPr>
+        <w:tabs>
+          <w:tab w:val="num" w:pos="2880"/>
+        </w:tabs>
+        <w:ind w:left="2880" w:hanging="360"/>
+      </w:pPr>
+      <w:rPr>
+        <w:rFonts w:ascii="Wingdings" w:hAnsi="Wingdings" w:hint="default"/>
+        <w:sz w:val="20"/>
+      </w:rPr>
+    </w:lvl>
+    <w:lvl w:ilvl="4" w:tentative="1">
+      <w:start w:val="1"/>
+      <w:numFmt w:val="bullet"/>
+      <w:lvlText w:val=""/>
+      <w:lvlJc w:val="left"/>
+      <w:pPr>
+        <w:tabs>
+          <w:tab w:val="num" w:pos="3600"/>
+        </w:tabs>
+        <w:ind w:left="3600" w:hanging="360"/>
+      </w:pPr>
+      <w:rPr>
+        <w:rFonts w:ascii="Wingdings" w:hAnsi="Wingdings" w:hint="default"/>
+        <w:sz w:val="20"/>
+      </w:rPr>
+    </w:lvl>
+    <w:lvl w:ilvl="5" w:tentative="1">
+      <w:start w:val="1"/>
+      <w:numFmt w:val="bullet"/>
+      <w:lvlText w:val=""/>
+      <w:lvlJc w:val="left"/>
+      <w:pPr>
+        <w:tabs>
+          <w:tab w:val="num" w:pos="4320"/>
+        </w:tabs>
+        <w:ind w:left="4320" w:hanging="360"/>
+      </w:pPr>
+      <w:rPr>
+        <w:rFonts w:ascii="Wingdings" w:hAnsi="Wingdings" w:hint="default"/>
+        <w:sz w:val="20"/>
+      </w:rPr>
+    </w:lvl>
+    <w:lvl w:ilvl="6" w:tentative="1">
+      <w:start w:val="1"/>
+      <w:numFmt w:val="bullet"/>
+      <w:lvlText w:val=""/>
+      <w:lvlJc w:val="left"/>
+      <w:pPr>
+        <w:tabs>
+          <w:tab w:val="num" w:pos="5040"/>
+        </w:tabs>
+        <w:ind w:left="5040" w:hanging="360"/>
+      </w:pPr>
+      <w:rPr>
+        <w:rFonts w:ascii="Wingdings" w:hAnsi="Wingdings" w:hint="default"/>
+        <w:sz w:val="20"/>
+      </w:rPr>
+    </w:lvl>
+    <w:lvl w:ilvl="7" w:tentative="1">
+      <w:start w:val="1"/>
+      <w:numFmt w:val="bullet"/>
+      <w:lvlText w:val=""/>
+      <w:lvlJc w:val="left"/>
+      <w:pPr>
+        <w:tabs>
+          <w:tab w:val="num" w:pos="5760"/>
+        </w:tabs>
+        <w:ind w:left="5760" w:hanging="360"/>
+      </w:pPr>
+      <w:rPr>
+        <w:rFonts w:ascii="Wingdings" w:hAnsi="Wingdings" w:hint="default"/>
+        <w:sz w:val="20"/>
+      </w:rPr>
+    </w:lvl>
+    <w:lvl w:ilvl="8" w:tentative="1">
+      <w:start w:val="1"/>
+      <w:numFmt w:val="bullet"/>
+      <w:lvlText w:val=""/>
+      <w:lvlJc w:val="left"/>
+      <w:pPr>
+        <w:tabs>
+          <w:tab w:val="num" w:pos="6480"/>
+        </w:tabs>
+        <w:ind w:left="6480" w:hanging="360"/>
+      </w:pPr>
+      <w:rPr>
+        <w:rFonts w:ascii="Wingdings" w:hAnsi="Wingdings" w:hint="default"/>
+        <w:sz w:val="20"/>
+      </w:rPr>
+    </w:lvl>
+  </w:abstractNum>
+  <w:num w:numId="1" w16cid:durableId="410323210">
+    <w:abstractNumId w:val="0"/>
+  </w:num>
+</w:numbering>
 </file>
 
 <file path=word/styles.xml><?xml version="1.0" encoding="utf-8"?>
@@ -2920,6 +3787,17 @@
       <w:spacing w:val="5"/>
     </w:rPr>
   </w:style>
+  <w:style w:type="paragraph" w:styleId="NormalWeb">
+    <w:name w:val="Normal (Web)"/>
+    <w:basedOn w:val="Normal"/>
+    <w:uiPriority w:val="99"/>
+    <w:semiHidden/>
+    <w:unhideWhenUsed/>
+    <w:rsid w:val="008527B1"/>
+    <w:rPr>
+      <w:rFonts w:ascii="Times New Roman" w:hAnsi="Times New Roman" w:cs="Times New Roman"/>
+    </w:rPr>
+  </w:style>
 </w:styles>
 </file>
 

</xml_diff>